<commit_message>
docs: add technical debt section to delivery document and slides
</commit_message>
<xml_diff>
--- a/docs/documento_entrega.docx
+++ b/docs/documento_entrega.docx
@@ -13139,7 +13139,385 @@
           <w:i w:val="0"/>
           <w:sz w:val="28"/>
         </w:rPr>
-        <w:t>8. Conclusão</w:t>
+        <w:t>8. Débitos Técnicos Conhecidos</w:t>
+      </w:r>
+    </w:p>
+    <w:p>
+      <w:pPr>
+        <w:spacing w:before="0" w:after="120" w:line="360" w:lineRule="exact"/>
+        <w:ind w:firstLine="709"/>
+        <w:jc w:val="both"/>
+      </w:pPr>
+      <w:r>
+        <w:rPr>
+          <w:rFonts w:ascii="Times New Roman" w:hAnsi="Times New Roman"/>
+          <w:b w:val="0"/>
+          <w:i w:val="0"/>
+          <w:sz w:val="24"/>
+        </w:rPr>
+        <w:t>O escopo do Tech Challenge Fase 1 priorizou a corretude de domínio, cobertura de testes e qualidade estática. Algumas decisões de implementação foram tomadas conscientemente como simplificações aceitáveis para um MVP, e estão listadas abaixo como débitos técnicos a serem endereçados em fases subsequentes.</w:t>
+      </w:r>
+    </w:p>
+    <w:tbl>
+      <w:tblPr>
+        <w:tblStyle w:val="TableGrid"/>
+        <w:tblW w:type="auto" w:w="0"/>
+        <w:tblLook w:firstColumn="1" w:firstRow="1" w:lastColumn="0" w:lastRow="0" w:noHBand="0" w:noVBand="1" w:val="04A0"/>
+      </w:tblPr>
+      <w:tblGrid>
+        <w:gridCol w:w="2268"/>
+        <w:gridCol w:w="2268"/>
+        <w:gridCol w:w="2268"/>
+        <w:gridCol w:w="2268"/>
+      </w:tblGrid>
+      <w:tr>
+        <w:tc>
+          <w:tcPr>
+            <w:tcW w:type="dxa" w:w="2268"/>
+          </w:tcPr>
+          <w:p>
+            <w:pPr>
+              <w:spacing w:before="40" w:after="40"/>
+            </w:pPr>
+            <w:r/>
+            <w:r>
+              <w:rPr>
+                <w:rFonts w:ascii="Times New Roman" w:hAnsi="Times New Roman"/>
+                <w:b/>
+                <w:i w:val="0"/>
+                <w:sz w:val="22"/>
+              </w:rPr>
+              <w:t>#</w:t>
+            </w:r>
+          </w:p>
+        </w:tc>
+        <w:tc>
+          <w:tcPr>
+            <w:tcW w:type="dxa" w:w="2268"/>
+          </w:tcPr>
+          <w:p>
+            <w:pPr>
+              <w:spacing w:before="40" w:after="40"/>
+            </w:pPr>
+            <w:r/>
+            <w:r>
+              <w:rPr>
+                <w:rFonts w:ascii="Times New Roman" w:hAnsi="Times New Roman"/>
+                <w:b/>
+                <w:i w:val="0"/>
+                <w:sz w:val="22"/>
+              </w:rPr>
+              <w:t>Débito</w:t>
+            </w:r>
+          </w:p>
+        </w:tc>
+        <w:tc>
+          <w:tcPr>
+            <w:tcW w:type="dxa" w:w="2268"/>
+          </w:tcPr>
+          <w:p>
+            <w:pPr>
+              <w:spacing w:before="40" w:after="40"/>
+            </w:pPr>
+            <w:r/>
+            <w:r>
+              <w:rPr>
+                <w:rFonts w:ascii="Times New Roman" w:hAnsi="Times New Roman"/>
+                <w:b/>
+                <w:i w:val="0"/>
+                <w:sz w:val="22"/>
+              </w:rPr>
+              <w:t>Impacto</w:t>
+            </w:r>
+          </w:p>
+        </w:tc>
+        <w:tc>
+          <w:tcPr>
+            <w:tcW w:type="dxa" w:w="2268"/>
+          </w:tcPr>
+          <w:p>
+            <w:pPr>
+              <w:spacing w:before="40" w:after="40"/>
+            </w:pPr>
+            <w:r/>
+            <w:r>
+              <w:rPr>
+                <w:rFonts w:ascii="Times New Roman" w:hAnsi="Times New Roman"/>
+                <w:b/>
+                <w:i w:val="0"/>
+                <w:sz w:val="22"/>
+              </w:rPr>
+              <w:t>Solução sugerida</w:t>
+            </w:r>
+          </w:p>
+        </w:tc>
+      </w:tr>
+      <w:tr>
+        <w:tc>
+          <w:tcPr>
+            <w:tcW w:type="dxa" w:w="2268"/>
+          </w:tcPr>
+          <w:p>
+            <w:pPr>
+              <w:spacing w:before="40" w:after="40"/>
+            </w:pPr>
+            <w:r/>
+            <w:r>
+              <w:rPr>
+                <w:rFonts w:ascii="Times New Roman" w:hAnsi="Times New Roman"/>
+                <w:b w:val="0"/>
+                <w:i w:val="0"/>
+                <w:sz w:val="22"/>
+              </w:rPr>
+              <w:t>1</w:t>
+            </w:r>
+          </w:p>
+        </w:tc>
+        <w:tc>
+          <w:tcPr>
+            <w:tcW w:type="dxa" w:w="2268"/>
+          </w:tcPr>
+          <w:p>
+            <w:pPr>
+              <w:spacing w:before="40" w:after="40"/>
+            </w:pPr>
+            <w:r/>
+            <w:r>
+              <w:rPr>
+                <w:rFonts w:ascii="Times New Roman" w:hAnsi="Times New Roman"/>
+                <w:b w:val="0"/>
+                <w:i w:val="0"/>
+                <w:sz w:val="22"/>
+              </w:rPr>
+              <w:t>Mappers manuais — conversão entre entidades JPA e objetos de domínio implementada manualmente nos adapters de persistência.</w:t>
+            </w:r>
+          </w:p>
+        </w:tc>
+        <w:tc>
+          <w:tcPr>
+            <w:tcW w:type="dxa" w:w="2268"/>
+          </w:tcPr>
+          <w:p>
+            <w:pPr>
+              <w:spacing w:before="40" w:after="40"/>
+            </w:pPr>
+            <w:r/>
+            <w:r>
+              <w:rPr>
+                <w:rFonts w:ascii="Times New Roman" w:hAnsi="Times New Roman"/>
+                <w:b w:val="0"/>
+                <w:i w:val="0"/>
+                <w:sz w:val="22"/>
+              </w:rPr>
+              <w:t>Boilerplate repetitivo; risco de campo esquecido ao adicionar atributos ao domínio.</w:t>
+            </w:r>
+          </w:p>
+        </w:tc>
+        <w:tc>
+          <w:tcPr>
+            <w:tcW w:type="dxa" w:w="2268"/>
+          </w:tcPr>
+          <w:p>
+            <w:pPr>
+              <w:spacing w:before="40" w:after="40"/>
+            </w:pPr>
+            <w:r/>
+            <w:r>
+              <w:rPr>
+                <w:rFonts w:ascii="Times New Roman" w:hAnsi="Times New Roman"/>
+                <w:b w:val="0"/>
+                <w:i w:val="0"/>
+                <w:sz w:val="22"/>
+              </w:rPr>
+              <w:t>Migrar para MapStruct (geração em compile-time, zero overhead em runtime) ou ModelMapper.</w:t>
+            </w:r>
+          </w:p>
+        </w:tc>
+      </w:tr>
+      <w:tr>
+        <w:tc>
+          <w:tcPr>
+            <w:tcW w:type="dxa" w:w="2268"/>
+          </w:tcPr>
+          <w:p>
+            <w:pPr>
+              <w:spacing w:before="40" w:after="40"/>
+            </w:pPr>
+            <w:r/>
+            <w:r>
+              <w:rPr>
+                <w:rFonts w:ascii="Times New Roman" w:hAnsi="Times New Roman"/>
+                <w:b w:val="0"/>
+                <w:i w:val="0"/>
+                <w:sz w:val="22"/>
+              </w:rPr>
+              <w:t>2</w:t>
+            </w:r>
+          </w:p>
+        </w:tc>
+        <w:tc>
+          <w:tcPr>
+            <w:tcW w:type="dxa" w:w="2268"/>
+          </w:tcPr>
+          <w:p>
+            <w:pPr>
+              <w:spacing w:before="40" w:after="40"/>
+            </w:pPr>
+            <w:r/>
+            <w:r>
+              <w:rPr>
+                <w:rFonts w:ascii="Times New Roman" w:hAnsi="Times New Roman"/>
+                <w:b w:val="0"/>
+                <w:i w:val="0"/>
+                <w:sz w:val="22"/>
+              </w:rPr>
+              <w:t>Serviço de Notificação stub — NotificacaoService é um port sem implementação concreta; e-mail e SMS não são enviados em produção.</w:t>
+            </w:r>
+          </w:p>
+        </w:tc>
+        <w:tc>
+          <w:tcPr>
+            <w:tcW w:type="dxa" w:w="2268"/>
+          </w:tcPr>
+          <w:p>
+            <w:pPr>
+              <w:spacing w:before="40" w:after="40"/>
+            </w:pPr>
+            <w:r/>
+            <w:r>
+              <w:rPr>
+                <w:rFonts w:ascii="Times New Roman" w:hAnsi="Times New Roman"/>
+                <w:b w:val="0"/>
+                <w:i w:val="0"/>
+                <w:sz w:val="22"/>
+              </w:rPr>
+              <w:t>Requisito de notificação ao cliente não atendido fora do ambiente de testes.</w:t>
+            </w:r>
+          </w:p>
+        </w:tc>
+        <w:tc>
+          <w:tcPr>
+            <w:tcW w:type="dxa" w:w="2268"/>
+          </w:tcPr>
+          <w:p>
+            <w:pPr>
+              <w:spacing w:before="40" w:after="40"/>
+            </w:pPr>
+            <w:r/>
+            <w:r>
+              <w:rPr>
+                <w:rFonts w:ascii="Times New Roman" w:hAnsi="Times New Roman"/>
+                <w:b w:val="0"/>
+                <w:i w:val="0"/>
+                <w:sz w:val="22"/>
+              </w:rPr>
+              <w:t>Implementar adapter com JavaMail, SendGrid ou AWS SES.</w:t>
+            </w:r>
+          </w:p>
+        </w:tc>
+      </w:tr>
+      <w:tr>
+        <w:tc>
+          <w:tcPr>
+            <w:tcW w:type="dxa" w:w="2268"/>
+          </w:tcPr>
+          <w:p>
+            <w:pPr>
+              <w:spacing w:before="40" w:after="40"/>
+            </w:pPr>
+            <w:r/>
+            <w:r>
+              <w:rPr>
+                <w:rFonts w:ascii="Times New Roman" w:hAnsi="Times New Roman"/>
+                <w:b w:val="0"/>
+                <w:i w:val="0"/>
+                <w:sz w:val="22"/>
+              </w:rPr>
+              <w:t>3</w:t>
+            </w:r>
+          </w:p>
+        </w:tc>
+        <w:tc>
+          <w:tcPr>
+            <w:tcW w:type="dxa" w:w="2268"/>
+          </w:tcPr>
+          <w:p>
+            <w:pPr>
+              <w:spacing w:before="40" w:after="40"/>
+            </w:pPr>
+            <w:r/>
+            <w:r>
+              <w:rPr>
+                <w:rFonts w:ascii="Times New Roman" w:hAnsi="Times New Roman"/>
+                <w:b w:val="0"/>
+                <w:i w:val="0"/>
+                <w:sz w:val="22"/>
+              </w:rPr>
+              <w:t>Construtor de reconstituição com muitos parâmetros — método fromPersistencia em OrdemServico possui 9 parâmetros (Sonar S107).</w:t>
+            </w:r>
+          </w:p>
+        </w:tc>
+        <w:tc>
+          <w:tcPr>
+            <w:tcW w:type="dxa" w:w="2268"/>
+          </w:tcPr>
+          <w:p>
+            <w:pPr>
+              <w:spacing w:before="40" w:after="40"/>
+            </w:pPr>
+            <w:r/>
+            <w:r>
+              <w:rPr>
+                <w:rFonts w:ascii="Times New Roman" w:hAnsi="Times New Roman"/>
+                <w:b w:val="0"/>
+                <w:i w:val="0"/>
+                <w:sz w:val="22"/>
+              </w:rPr>
+              <w:t>Code smell de manutenibilidade apontado pelo SonarCloud.</w:t>
+            </w:r>
+          </w:p>
+        </w:tc>
+        <w:tc>
+          <w:tcPr>
+            <w:tcW w:type="dxa" w:w="2268"/>
+          </w:tcPr>
+          <w:p>
+            <w:pPr>
+              <w:spacing w:before="40" w:after="40"/>
+            </w:pPr>
+            <w:r/>
+            <w:r>
+              <w:rPr>
+                <w:rFonts w:ascii="Times New Roman" w:hAnsi="Times New Roman"/>
+                <w:b w:val="0"/>
+                <w:i w:val="0"/>
+                <w:sz w:val="22"/>
+              </w:rPr>
+              <w:t>Encapsular os parâmetros em um record DadosOrdemServico e receber como argumento único.</w:t>
+            </w:r>
+          </w:p>
+        </w:tc>
+      </w:tr>
+    </w:tbl>
+    <w:p/>
+    <w:p>
+      <w:r>
+        <w:br w:type="page"/>
+      </w:r>
+    </w:p>
+    <w:p>
+      <w:pPr>
+        <w:spacing w:before="360" w:after="120" w:line="360" w:lineRule="exact"/>
+        <w:jc w:val="left"/>
+      </w:pPr>
+      <w:r>
+        <w:rPr>
+          <w:rFonts w:ascii="Times New Roman" w:hAnsi="Times New Roman"/>
+          <w:b/>
+          <w:i w:val="0"/>
+          <w:sz w:val="28"/>
+        </w:rPr>
+        <w:t>9. Conclusão</w:t>
       </w:r>
     </w:p>
     <w:p>
@@ -13239,7 +13617,7 @@
           <w:i w:val="0"/>
           <w:sz w:val="28"/>
         </w:rPr>
-        <w:t>9. Referências Bibliográficas</w:t>
+        <w:t>10. Referências Bibliográficas</w:t>
       </w:r>
     </w:p>
     <w:p>

</xml_diff>

<commit_message>
docs: add unpatched CVEs as technical debt item #4
</commit_message>
<xml_diff>
--- a/docs/documento_entrega.docx
+++ b/docs/documento_entrega.docx
@@ -13494,6 +13494,88 @@
                 <w:sz w:val="22"/>
               </w:rPr>
               <w:t>Encapsular os parâmetros em um record DadosOrdemServico e receber como argumento único.</w:t>
+            </w:r>
+          </w:p>
+        </w:tc>
+      </w:tr>
+      <w:tr>
+        <w:tc>
+          <w:tcPr>
+            <w:tcW w:type="dxa" w:w="2268"/>
+          </w:tcPr>
+          <w:p>
+            <w:pPr>
+              <w:spacing w:before="40" w:after="40"/>
+            </w:pPr>
+            <w:r/>
+            <w:r>
+              <w:rPr>
+                <w:rFonts w:ascii="Times New Roman" w:hAnsi="Times New Roman"/>
+                <w:b w:val="0"/>
+                <w:i w:val="0"/>
+                <w:sz w:val="22"/>
+              </w:rPr>
+              <w:t>4</w:t>
+            </w:r>
+          </w:p>
+        </w:tc>
+        <w:tc>
+          <w:tcPr>
+            <w:tcW w:type="dxa" w:w="2268"/>
+          </w:tcPr>
+          <w:p>
+            <w:pPr>
+              <w:spacing w:before="40" w:after="40"/>
+            </w:pPr>
+            <w:r/>
+            <w:r>
+              <w:rPr>
+                <w:rFonts w:ascii="Times New Roman" w:hAnsi="Times New Roman"/>
+                <w:b w:val="0"/>
+                <w:i w:val="0"/>
+                <w:sz w:val="22"/>
+              </w:rPr>
+              <w:t>CVEs sem patch disponível — CVE-2026-22732 (Spring Security 6.4.5) e CVE-2025-55754, CVE-2025-66614, CVE-2026-29145 (Tomcat 10.1.40) sem versão corrigida em 01/05/2026. Testado também em Spring Boot 3.5.0 (Tomcat 10.1.41 + Spring Security 6.5.0) com mesmo resultado.</w:t>
+            </w:r>
+          </w:p>
+        </w:tc>
+        <w:tc>
+          <w:tcPr>
+            <w:tcW w:type="dxa" w:w="2268"/>
+          </w:tcPr>
+          <w:p>
+            <w:pPr>
+              <w:spacing w:before="40" w:after="40"/>
+            </w:pPr>
+            <w:r/>
+            <w:r>
+              <w:rPr>
+                <w:rFonts w:ascii="Times New Roman" w:hAnsi="Times New Roman"/>
+                <w:b w:val="0"/>
+                <w:i w:val="0"/>
+                <w:sz w:val="22"/>
+              </w:rPr>
+              <w:t>Vulnerabilidades críticas (CVSS ≥ 9.0) suprimidas com justificativa documentada em owasp-suppressions.xml; não endereçáveis por upgrade enquanto fornecedores não publicarem patch.</w:t>
+            </w:r>
+          </w:p>
+        </w:tc>
+        <w:tc>
+          <w:tcPr>
+            <w:tcW w:type="dxa" w:w="2268"/>
+          </w:tcPr>
+          <w:p>
+            <w:pPr>
+              <w:spacing w:before="40" w:after="40"/>
+            </w:pPr>
+            <w:r/>
+            <w:r>
+              <w:rPr>
+                <w:rFonts w:ascii="Times New Roman" w:hAnsi="Times New Roman"/>
+                <w:b w:val="0"/>
+                <w:i w:val="0"/>
+                <w:sz w:val="22"/>
+              </w:rPr>
+              <w:t>Monitorar releases do Apache Tomcat e Spring Security; remover supressões e retestar quando patches forem publicados.</w:t>
             </w:r>
           </w:p>
         </w:tc>

</xml_diff>